<commit_message>
Align combined DW model for accidents and air quality
- Add air-quality datasource documentation focused on daily AQI by county and map new category/defining-parameter dimensions.

- Add air-quality star schema SQL with fact_air_quality_daily and supporting Type 2 dimensions/indexes.

- Update accidents schema and documentation for conformed cross-source joins via county_location_key while preserving detailed location_key.

- Clarify shared time semantics (YYYYMMDD00 day anchor) and shared-location dual-key behavior across both datasource docs.

- Add root script pg-apply-air-schema.sh and validate end-to-end schema reset/reapply flow.

- Include updated project artifacts and combined schema diagrams currently present in the working tree.
</commit_message>
<xml_diff>
--- a/naloga1/Ekipa12_Predlog_BI.docx
+++ b/naloga1/Ekipa12_Predlog_BI.docx
@@ -1912,8 +1912,8 @@
       </w:tblPr>
       <w:tblGrid>
         <w:gridCol w:w="627"/>
-        <w:gridCol w:w="5708"/>
-        <w:gridCol w:w="2661"/>
+        <w:gridCol w:w="5707"/>
+        <w:gridCol w:w="2662"/>
       </w:tblGrid>
       <w:tr>
         <w:trPr/>
@@ -1955,7 +1955,7 @@
         </w:tc>
         <w:tc>
           <w:tcPr>
-            <w:tcW w:w="5708" w:type="dxa"/>
+            <w:tcW w:w="5707" w:type="dxa"/>
             <w:vMerge w:val="restart"/>
             <w:tcBorders>
               <w:top w:val="single" w:sz="12" w:space="0" w:color="000000"/>
@@ -2216,7 +2216,7 @@
         </w:tc>
         <w:tc>
           <w:tcPr>
-            <w:tcW w:w="2661" w:type="dxa"/>
+            <w:tcW w:w="2662" w:type="dxa"/>
             <w:vMerge w:val="restart"/>
             <w:tcBorders>
               <w:top w:val="single" w:sz="12" w:space="0" w:color="000000"/>
@@ -2483,7 +2483,7 @@
         </w:tc>
         <w:tc>
           <w:tcPr>
-            <w:tcW w:w="5708" w:type="dxa"/>
+            <w:tcW w:w="5707" w:type="dxa"/>
             <w:vMerge w:val="continue"/>
             <w:tcBorders/>
           </w:tcPr>
@@ -2509,7 +2509,7 @@
         </w:tc>
         <w:tc>
           <w:tcPr>
-            <w:tcW w:w="2661" w:type="dxa"/>
+            <w:tcW w:w="2662" w:type="dxa"/>
             <w:vMerge w:val="continue"/>
             <w:tcBorders>
               <w:end w:val="single" w:sz="12" w:space="0" w:color="000000"/>
@@ -2572,7 +2572,7 @@
         </w:tc>
         <w:tc>
           <w:tcPr>
-            <w:tcW w:w="5708" w:type="dxa"/>
+            <w:tcW w:w="5707" w:type="dxa"/>
             <w:vMerge w:val="continue"/>
             <w:tcBorders/>
           </w:tcPr>
@@ -2598,7 +2598,7 @@
         </w:tc>
         <w:tc>
           <w:tcPr>
-            <w:tcW w:w="2661" w:type="dxa"/>
+            <w:tcW w:w="2662" w:type="dxa"/>
             <w:vMerge w:val="continue"/>
             <w:tcBorders>
               <w:end w:val="single" w:sz="12" w:space="0" w:color="000000"/>
@@ -2661,7 +2661,7 @@
         </w:tc>
         <w:tc>
           <w:tcPr>
-            <w:tcW w:w="5708" w:type="dxa"/>
+            <w:tcW w:w="5707" w:type="dxa"/>
             <w:vMerge w:val="continue"/>
             <w:tcBorders/>
           </w:tcPr>
@@ -2687,7 +2687,7 @@
         </w:tc>
         <w:tc>
           <w:tcPr>
-            <w:tcW w:w="2661" w:type="dxa"/>
+            <w:tcW w:w="2662" w:type="dxa"/>
             <w:vMerge w:val="continue"/>
             <w:tcBorders>
               <w:end w:val="single" w:sz="12" w:space="0" w:color="000000"/>
@@ -2788,8 +2788,8 @@
       </w:tblPr>
       <w:tblGrid>
         <w:gridCol w:w="627"/>
-        <w:gridCol w:w="5708"/>
-        <w:gridCol w:w="2661"/>
+        <w:gridCol w:w="5707"/>
+        <w:gridCol w:w="2662"/>
       </w:tblGrid>
       <w:tr>
         <w:trPr/>
@@ -2831,7 +2831,7 @@
         </w:tc>
         <w:tc>
           <w:tcPr>
-            <w:tcW w:w="5708" w:type="dxa"/>
+            <w:tcW w:w="5707" w:type="dxa"/>
             <w:vMerge w:val="restart"/>
             <w:tcBorders>
               <w:top w:val="single" w:sz="12" w:space="0" w:color="000000"/>
@@ -2894,6 +2894,17 @@
               </w:rPr>
               <w:t>AQI</w:t>
             </w:r>
+            <w:r>
+              <w:rPr>
+                <w:rFonts w:eastAsia="Aptos" w:cs=""/>
+                <w:color w:val="0000FF"/>
+                <w:kern w:val="2"/>
+                <w:sz w:val="22"/>
+                <w:szCs w:val="22"/>
+                <w:lang w:eastAsia="en-US" w:bidi="ar-SA"/>
+              </w:rPr>
+              <w:t xml:space="preserve"> measurment value</w:t>
+            </w:r>
           </w:p>
           <w:p>
             <w:pPr>
@@ -2925,79 +2936,13 @@
                 <w:szCs w:val="22"/>
                 <w:lang w:eastAsia="en-US" w:bidi="ar-SA"/>
               </w:rPr>
-              <w:t>pm25</w:t>
-            </w:r>
-          </w:p>
-          <w:p>
-            <w:pPr>
-              <w:pStyle w:val="ListParagraph"/>
-              <w:widowControl/>
-              <w:numPr>
-                <w:ilvl w:val="0"/>
-                <w:numId w:val="2"/>
-              </w:numPr>
-              <w:suppressAutoHyphens w:val="true"/>
-              <w:spacing w:lineRule="auto" w:line="276" w:before="0" w:after="0"/>
-              <w:contextualSpacing/>
-              <w:jc w:val="both"/>
-              <w:rPr>
-                <w:rFonts w:ascii="Aptos Display" w:hAnsi="Aptos Display" w:eastAsia="Aptos" w:cs="Calibri" w:asciiTheme="majorHAnsi" w:hAnsiTheme="majorHAnsi"/>
-                <w:color w:val="0000FF"/>
-                <w:kern w:val="2"/>
-                <w:sz w:val="22"/>
-                <w:szCs w:val="22"/>
-                <w:lang w:eastAsia="en-US" w:bidi="ar-SA"/>
-              </w:rPr>
-            </w:pPr>
-            <w:r>
-              <w:rPr>
-                <w:rFonts w:eastAsia="Aptos" w:cs="Calibri" w:ascii="Aptos Display" w:hAnsi="Aptos Display"/>
-                <w:color w:val="0000FF"/>
-                <w:kern w:val="2"/>
-                <w:sz w:val="22"/>
-                <w:szCs w:val="22"/>
-                <w:lang w:eastAsia="en-US" w:bidi="ar-SA"/>
-              </w:rPr>
-              <w:t>ozone</w:t>
-            </w:r>
-          </w:p>
-          <w:p>
-            <w:pPr>
-              <w:pStyle w:val="ListParagraph"/>
-              <w:widowControl/>
-              <w:numPr>
-                <w:ilvl w:val="0"/>
-                <w:numId w:val="2"/>
-              </w:numPr>
-              <w:suppressAutoHyphens w:val="true"/>
-              <w:spacing w:lineRule="auto" w:line="276" w:before="0" w:after="0"/>
-              <w:contextualSpacing/>
-              <w:jc w:val="both"/>
-              <w:rPr>
-                <w:rFonts w:ascii="Aptos Display" w:hAnsi="Aptos Display" w:eastAsia="Aptos" w:cs="Calibri" w:asciiTheme="majorHAnsi" w:hAnsiTheme="majorHAnsi"/>
-                <w:color w:val="0000FF"/>
-                <w:kern w:val="2"/>
-                <w:sz w:val="22"/>
-                <w:szCs w:val="22"/>
-                <w:lang w:eastAsia="en-US" w:bidi="ar-SA"/>
-              </w:rPr>
-            </w:pPr>
-            <w:r>
-              <w:rPr>
-                <w:rFonts w:eastAsia="Aptos" w:cs="Calibri" w:ascii="Aptos Display" w:hAnsi="Aptos Display"/>
-                <w:color w:val="0000FF"/>
-                <w:kern w:val="2"/>
-                <w:sz w:val="22"/>
-                <w:szCs w:val="22"/>
-                <w:lang w:eastAsia="en-US" w:bidi="ar-SA"/>
-              </w:rPr>
-              <w:t>co</w:t>
-            </w:r>
-          </w:p>
-        </w:tc>
-        <w:tc>
-          <w:tcPr>
-            <w:tcW w:w="2661" w:type="dxa"/>
+              <w:t>Number of sites reporting</w:t>
+            </w:r>
+          </w:p>
+        </w:tc>
+        <w:tc>
+          <w:tcPr>
+            <w:tcW w:w="2662" w:type="dxa"/>
             <w:vMerge w:val="restart"/>
             <w:tcBorders>
               <w:top w:val="single" w:sz="12" w:space="0" w:color="000000"/>
@@ -3113,7 +3058,7 @@
             </w:pPr>
             <w:r>
               <w:rPr>
-                <w:rFonts w:eastAsia="Aptos" w:cs="Calibri" w:ascii="Aptos Display" w:hAnsi="Aptos Display" w:asciiTheme="majorHAnsi" w:hAnsiTheme="majorHAnsi"/>
+                <w:rFonts w:eastAsia="Aptos" w:cs="Calibri" w:ascii="Aptos Display" w:hAnsi="Aptos Display"/>
                 <w:color w:val="0000FF"/>
                 <w:kern w:val="2"/>
                 <w:sz w:val="22"/>
@@ -3121,6 +3066,74 @@
                 <w:lang w:eastAsia="en-US" w:bidi="ar-SA"/>
               </w:rPr>
               <w:t>Location</w:t>
+            </w:r>
+          </w:p>
+          <w:p>
+            <w:pPr>
+              <w:pStyle w:val="ListParagraph"/>
+              <w:widowControl/>
+              <w:numPr>
+                <w:ilvl w:val="0"/>
+                <w:numId w:val="1"/>
+              </w:numPr>
+              <w:suppressAutoHyphens w:val="true"/>
+              <w:spacing w:lineRule="auto" w:line="276" w:before="0" w:after="0"/>
+              <w:ind w:hanging="132" w:start="132"/>
+              <w:contextualSpacing/>
+              <w:jc w:val="both"/>
+              <w:rPr>
+                <w:rFonts w:ascii="Aptos" w:hAnsi="Aptos" w:eastAsia="Aptos" w:cs=""/>
+                <w:color w:val="0000FF"/>
+                <w:kern w:val="2"/>
+                <w:sz w:val="22"/>
+                <w:szCs w:val="22"/>
+                <w:lang w:eastAsia="en-US" w:bidi="ar-SA"/>
+              </w:rPr>
+            </w:pPr>
+            <w:r>
+              <w:rPr>
+                <w:rFonts w:eastAsia="Aptos" w:cs=""/>
+                <w:color w:val="0000FF"/>
+                <w:kern w:val="2"/>
+                <w:sz w:val="22"/>
+                <w:szCs w:val="22"/>
+                <w:lang w:eastAsia="en-US" w:bidi="ar-SA"/>
+              </w:rPr>
+              <w:t>Defining parameter</w:t>
+            </w:r>
+          </w:p>
+          <w:p>
+            <w:pPr>
+              <w:pStyle w:val="ListParagraph"/>
+              <w:widowControl/>
+              <w:numPr>
+                <w:ilvl w:val="0"/>
+                <w:numId w:val="1"/>
+              </w:numPr>
+              <w:suppressAutoHyphens w:val="true"/>
+              <w:spacing w:lineRule="auto" w:line="276" w:before="0" w:after="0"/>
+              <w:ind w:hanging="132" w:start="132"/>
+              <w:contextualSpacing/>
+              <w:jc w:val="both"/>
+              <w:rPr>
+                <w:rFonts w:ascii="Aptos" w:hAnsi="Aptos" w:eastAsia="Aptos" w:cs=""/>
+                <w:color w:val="0000FF"/>
+                <w:kern w:val="2"/>
+                <w:sz w:val="22"/>
+                <w:szCs w:val="22"/>
+                <w:lang w:eastAsia="en-US" w:bidi="ar-SA"/>
+              </w:rPr>
+            </w:pPr>
+            <w:r>
+              <w:rPr>
+                <w:rFonts w:eastAsia="Aptos" w:cs=""/>
+                <w:color w:val="0000FF"/>
+                <w:kern w:val="2"/>
+                <w:sz w:val="22"/>
+                <w:szCs w:val="22"/>
+                <w:lang w:eastAsia="en-US" w:bidi="ar-SA"/>
+              </w:rPr>
+              <w:t>AQI category</w:t>
             </w:r>
           </w:p>
         </w:tc>
@@ -3162,7 +3175,7 @@
         </w:tc>
         <w:tc>
           <w:tcPr>
-            <w:tcW w:w="5708" w:type="dxa"/>
+            <w:tcW w:w="5707" w:type="dxa"/>
             <w:vMerge w:val="continue"/>
             <w:tcBorders/>
           </w:tcPr>
@@ -3188,7 +3201,7 @@
         </w:tc>
         <w:tc>
           <w:tcPr>
-            <w:tcW w:w="2661" w:type="dxa"/>
+            <w:tcW w:w="2662" w:type="dxa"/>
             <w:vMerge w:val="continue"/>
             <w:tcBorders>
               <w:end w:val="single" w:sz="12" w:space="0" w:color="000000"/>
@@ -3250,7 +3263,7 @@
         </w:tc>
         <w:tc>
           <w:tcPr>
-            <w:tcW w:w="5708" w:type="dxa"/>
+            <w:tcW w:w="5707" w:type="dxa"/>
             <w:vMerge w:val="continue"/>
             <w:tcBorders/>
           </w:tcPr>
@@ -3276,7 +3289,7 @@
         </w:tc>
         <w:tc>
           <w:tcPr>
-            <w:tcW w:w="2661" w:type="dxa"/>
+            <w:tcW w:w="2662" w:type="dxa"/>
             <w:vMerge w:val="continue"/>
             <w:tcBorders>
               <w:end w:val="single" w:sz="12" w:space="0" w:color="000000"/>
@@ -3339,7 +3352,7 @@
         </w:tc>
         <w:tc>
           <w:tcPr>
-            <w:tcW w:w="5708" w:type="dxa"/>
+            <w:tcW w:w="5707" w:type="dxa"/>
             <w:vMerge w:val="continue"/>
             <w:tcBorders/>
           </w:tcPr>
@@ -3365,7 +3378,7 @@
         </w:tc>
         <w:tc>
           <w:tcPr>
-            <w:tcW w:w="2661" w:type="dxa"/>
+            <w:tcW w:w="2662" w:type="dxa"/>
             <w:vMerge w:val="continue"/>
             <w:tcBorders>
               <w:end w:val="single" w:sz="12" w:space="0" w:color="000000"/>
@@ -4864,8 +4877,8 @@
       <w:u w:val="single"/>
     </w:rPr>
   </w:style>
-  <w:style w:type="character" w:styleId="Bulletsuser">
-    <w:name w:val="Bullets (user)"/>
+  <w:style w:type="character" w:styleId="Bullets">
+    <w:name w:val="Bullets"/>
     <w:qFormat/>
     <w:rPr>
       <w:rFonts w:ascii="OpenSymbol" w:hAnsi="OpenSymbol" w:eastAsia="OpenSymbol" w:cs="OpenSymbol"/>

</xml_diff>